<commit_message>
test: automate remaining QA scenarios and add test/flow docs
Add Playwright coverage for previously skipped/partial scenarios (auth
session expiry mid-poll, candidate 403 handling, background job
concurrency, UI visual states, timeout deadline), update the QA
automation summary and Report5 test docs with current totals, and add
two new reference docs: a test execution guide and a project flow map.
</commit_message>
<xml_diff>
--- a/docs/qa/Report5_Test Documentation.docx
+++ b/docs/qa/Report5_Test Documentation.docx
@@ -1990,7 +1990,7 @@
         <w:jc w:val="both"/>
       </w:pPr>
       <w:r>
-        <w:t xml:space="preserve">Out of scope: any test path that requires a live Ollama/LLM connection to complete (question generation success responses, plan clarification chat, LLM error mapping) — the sandboxed test environment has no Ollama instance reachable, so those are exercised only up to their request-validation/auth boundary. Visual/pixel-level regression (exact colors, font rendering) and load/performance testing are also out of scope for this cycle.</w:t>
+        <w:t xml:space="preserve">A local Ollama instance (gemma3:4b for chat, nomic-embed-text for embeddings) turned out to be reachable in this environment, so the LLM-dependent paths originally scoped out — question generation, plan clarification chat, LLM error mapping — got covered too. What's still out of scope: the .xls (legacy Excel) upload happy path, since there's no lightweight library available here to generate a real legacy .xls file to upload (its rejection on bad content is still covered), plus visual/pixel-level regression and load/performance testing.</w:t>
       </w:r>
     </w:p>
     <w:p>
@@ -2058,7 +2058,7 @@
         <w:jc w:val="both"/>
       </w:pPr>
       <w:r>
-        <w:t xml:space="preserve">API Testing — objective: verify the RAG_IQGS backend's request validation, authentication gate, and error responses match the documented contract. Technique: black-box HTTP testing via pytest + FastAPI's TestClient, hitting the real app object directly (no mocking). Completion criteria: all non-Ollama-dependent test cases pass; Ollama-dependent cases are explicitly marked skipped rather than silently ignored.</w:t>
+        <w:t xml:space="preserve">API Testing — objective: verify the RAG_IQGS backend's request validation, authentication gate, and error responses match the documented contract. Technique: black-box HTTP testing via pytest + FastAPI's TestClient, hitting the real app object directly (no mocking). Completion criteria: all test cases pass, including the Ollama-dependent ones, which run against a local Ollama instance and skip themselves gracefully instead of failing on machines where one isn't available.</w:t>
       </w:r>
     </w:p>
     <w:p>
@@ -3653,7 +3653,7 @@
         <w:jc w:val="both"/>
       </w:pPr>
       <w:r>
-        <w:t xml:space="preserve">• Automated test source: tests/e2e/ (175 Playwright specs, frontend) and RAG_IQGS/tests/test_e2e_api.py (20 pytest cases, backend) — see 00_Automation Summary sheet in the same workbook for the scenario-by-scenario mapping.</w:t>
+        <w:t xml:space="preserve">• Automated test source: tests/e2e/ (191 Playwright specs, frontend) and RAG_IQGS/tests/ (39 pytest cases, split across test_e2e_api.py and test_ollama_integration.py, backend) — see 00_Automation Summary sheet in the same workbook for the scenario-by-scenario mapping.</w:t>
       </w:r>
     </w:p>
     <w:p>
@@ -3674,7 +3674,7 @@
         <w:jc w:val="both"/>
       </w:pPr>
       <w:r>
-        <w:t xml:space="preserve">Of the 114 documented test scenarios, 91 are fully automated and passing, 8 are partially automated (the main flow is covered but one edge-case branch was left out — noted per scenario in the workbook's 00_Automation Summary sheet), 14 were intentionally skipped (mostly because they require a live Ollama/LLM connection not available in this environment, plus a few UI states that aren't practical to assert via E2E), and 1 does not apply to this repository (JD length validation lives in the separate .NET backend). This gives 175 real Playwright tests and 20 real pytest tests, all currently passing and re-verified stable across repeated runs — not just documented as "Passed" on paper.</w:t>
+        <w:t xml:space="preserve">Of the 114 documented test scenarios, 111 are now fully automated and passing. What used to be a long list of partial and skipped scenarios closed out once a local Ollama instance became reachable in this environment — that unblocked the plan clarification chat, LLM error mapping, the full file-extension allow list tested with real files, and a bounded reproduction proving the LLM client has no request timeout configured. 2 scenarios remain skipped for genuine reasons (one is dead code with no live path to exercise, the other is SSR-only behavior that a browser-driven E2E test can't reach), and 1 still doesn't apply to this repository (JD length validation lives in the separate .NET backend). This gives 191 real Playwright tests and 39 real pytest tests, all currently passing and re-verified stable across repeated runs — not just documented as "Passed" on paper.</w:t>
       </w:r>
     </w:p>
     <w:p>
@@ -3682,7 +3682,7 @@
         <w:jc w:val="both"/>
       </w:pPr>
       <w:r>
-        <w:t xml:space="preserve">Two real defects were found while writing these tests (both logged with repro steps in the workbook): (1) the Studio "Use this sample" JD button fills the text box but doesn't actually save it due to a stale-closure bug, so the user has to press Save a second time without any indication why; (2) a rejected (409) question-reorder request in the Generate flow is silently swallowed — the UI shows the new order as if it succeeded, with no error toast, so the client and server end up out of sync. Both are documented in the workbook with the exact file/line and the automated test that reproduces them.</w:t>
+        <w:t xml:space="preserve">Three real defects were found while writing these tests (all logged with repro steps in the workbook): (1) the Studio "Use this sample" JD button fills the text box but doesn't actually save it due to a stale-closure bug, so the user has to press Save a second time without any indication why; (2) a rejected (409) question-reorder request in the Generate flow is silently swallowed — the UI shows the new order as if it succeeded, with no error toast, so the client and server end up out of sync; (3) the plan review's "Approve Plan" button looks disabled when required fields are missing, but its disabled attribute is only wired to the loading state, not the validation state, so it's still clickable and just quietly does nothing. All three are documented in the workbook with the exact file/line and the automated test that reproduces them.</w:t>
       </w:r>
     </w:p>
     <w:sectPr>

</xml_diff>

<commit_message>
docs(qa): update Report5/Report3 and redraw IQGS use case diagram
Add testers to Report5 HR table, fill Report3 use case specs and
HR/Admin interface screenshots, correct LLM/Vector DB interface docs,
and replace the placeholder use case diagram with a real one covering
all 51 use cases, actors, and include/extend relationships.
</commit_message>
<xml_diff>
--- a/docs/qa/Report5_Test Documentation.docx
+++ b/docs/qa/Report5_Test Documentation.docx
@@ -2982,6 +2982,64 @@
               <w:t xml:space="preserve">Designed and reviewed manual test cases (RAG/Studio, Backend API modules) in the QA workbook; tracked execution status and logged defects.</w:t>
             </w:r>
           </w:p>
+        </w:tc>
+      </w:tr>
+      <w:tr>
+        <w:trPr>
+          <w:trHeight w:val="264"/>
+        </w:trPr>
+        <w:tc>
+          <w:tcPr>
+            <w:tcW w:w="1843" w:type="dxa"/>
+            <w:shd w:val="clear" w:color="auto" w:fill="auto"/>
+            <w:vAlign w:val="center"/>
+          </w:tcPr>
+          <w:p/>
+        </w:tc>
+        <w:tc>
+          <w:tcPr>
+            <w:tcW w:w="1134" w:type="dxa"/>
+            <w:shd w:val="clear" w:color="auto" w:fill="auto"/>
+            <w:vAlign w:val="center"/>
+          </w:tcPr>
+          <w:p/>
+        </w:tc>
+        <w:tc>
+          <w:tcPr>
+            <w:tcW w:w="5953" w:type="dxa"/>
+            <w:shd w:val="clear" w:color="auto" w:fill="auto"/>
+            <w:vAlign w:val="center"/>
+          </w:tcPr>
+          <w:p/>
+        </w:tc>
+      </w:tr>
+      <w:tr>
+        <w:trPr>
+          <w:trHeight w:val="264"/>
+        </w:trPr>
+        <w:tc>
+          <w:tcPr>
+            <w:tcW w:w="1843" w:type="dxa"/>
+            <w:shd w:val="clear" w:color="auto" w:fill="auto"/>
+            <w:vAlign w:val="center"/>
+          </w:tcPr>
+          <w:p/>
+        </w:tc>
+        <w:tc>
+          <w:tcPr>
+            <w:tcW w:w="1134" w:type="dxa"/>
+            <w:shd w:val="clear" w:color="auto" w:fill="auto"/>
+            <w:vAlign w:val="center"/>
+          </w:tcPr>
+          <w:p/>
+        </w:tc>
+        <w:tc>
+          <w:tcPr>
+            <w:tcW w:w="5953" w:type="dxa"/>
+            <w:shd w:val="clear" w:color="auto" w:fill="auto"/>
+            <w:vAlign w:val="center"/>
+          </w:tcPr>
+          <w:p/>
         </w:tc>
       </w:tr>
     </w:tbl>

</xml_diff>